<commit_message>
fix bug mention manuscrite
</commit_message>
<xml_diff>
--- a/document_templates/Contracts/company/with_pledge/contract_company_with_pledge.docx
+++ b/document_templates/Contracts/company/with_pledge/contract_company_with_pledge.docx
@@ -1788,7 +1788,6 @@
           <w:b/>
           <w:sz w:val="24"/>
           <w:szCs w:val="24"/>
-          <w:highlight w:val="none"/>
         </w:rPr>
       </w:pPr>
       <w:r>
@@ -1871,6 +1870,66 @@
         </w:rPr>
         <w:t>elon la grille de l’assureur</w:t>
       </w:r>
+    </w:p>
+    <w:p>
+      <w:pPr>
+        <w:tabs>
+          <w:tab w:val="left" w:pos="708"/>
+          <w:tab w:val="left" w:pos="1416"/>
+          <w:tab w:val="left" w:pos="2124"/>
+          <w:tab w:val="left" w:pos="2748"/>
+          <w:tab w:val="left" w:pos="3708"/>
+        </w:tabs>
+        <w:spacing w:line="240" w:lineRule="auto"/>
+        <w:jc w:val="both"/>
+        <w:rPr>
+          <w:rFonts w:hint="default" w:cs="Times New Roman"/>
+          <w:b/>
+          <w:sz w:val="24"/>
+          <w:szCs w:val="24"/>
+          <w:lang w:val="en-US"/>
+        </w:rPr>
+      </w:pPr>
+      <w:r>
+        <w:rPr>
+          <w:rFonts w:hint="default" w:cs="Times New Roman"/>
+          <w:b/>
+          <w:sz w:val="24"/>
+          <w:szCs w:val="24"/>
+          <w:lang w:val="en-US"/>
+        </w:rPr>
+        <w:tab/>
+      </w:r>
+    </w:p>
+    <w:p>
+      <w:pPr>
+        <w:tabs>
+          <w:tab w:val="left" w:pos="708"/>
+          <w:tab w:val="left" w:pos="1416"/>
+          <w:tab w:val="left" w:pos="2124"/>
+          <w:tab w:val="left" w:pos="2748"/>
+          <w:tab w:val="left" w:pos="3708"/>
+        </w:tabs>
+        <w:spacing w:line="240" w:lineRule="auto"/>
+        <w:jc w:val="both"/>
+        <w:rPr>
+          <w:rFonts w:hint="default" w:ascii="Times New Roman" w:hAnsi="Times New Roman" w:cs="Times New Roman"/>
+          <w:b/>
+          <w:sz w:val="24"/>
+          <w:szCs w:val="24"/>
+          <w:lang w:val="en-US"/>
+        </w:rPr>
+      </w:pPr>
+      <w:r>
+        <w:rPr>
+          <w:rFonts w:hint="default" w:ascii="Times New Roman" w:hAnsi="Times New Roman" w:cs="Times New Roman"/>
+          <w:b/>
+          <w:sz w:val="24"/>
+          <w:szCs w:val="24"/>
+          <w:lang w:val="en-US"/>
+        </w:rPr>
+        <w:tab/>
+      </w:r>
       <w:r>
         <w:rPr>
           <w:rFonts w:hint="default" w:ascii="Times New Roman" w:hAnsi="Times New Roman" w:cs="Times New Roman"/>
@@ -1887,10 +1946,125 @@
           <w:b/>
           <w:sz w:val="24"/>
           <w:szCs w:val="24"/>
+          <w:lang w:val="en-US"/>
+        </w:rPr>
+        <w:tab/>
+      </w:r>
+      <w:r>
+        <w:rPr>
+          <w:rFonts w:hint="default" w:ascii="Times New Roman" w:hAnsi="Times New Roman" w:cs="Times New Roman"/>
+          <w:b/>
+          <w:sz w:val="24"/>
+          <w:szCs w:val="24"/>
+          <w:lang w:val="en-US"/>
+        </w:rPr>
+        <w:tab/>
+      </w:r>
+      <w:r>
+        <w:rPr>
+          <w:rFonts w:hint="default" w:ascii="Times New Roman" w:hAnsi="Times New Roman" w:cs="Times New Roman"/>
+          <w:b/>
+          <w:sz w:val="24"/>
+          <w:szCs w:val="24"/>
+          <w:lang w:val="en-US"/>
+        </w:rPr>
+        <w:t>: ${line_risk_premium_percentage_value}</w:t>
+      </w:r>
+      <w:bookmarkStart w:id="6" w:name="_GoBack"/>
+      <w:bookmarkEnd w:id="6"/>
+    </w:p>
+    <w:p>
+      <w:pPr>
+        <w:tabs>
+          <w:tab w:val="left" w:pos="708"/>
+          <w:tab w:val="left" w:pos="1416"/>
+          <w:tab w:val="left" w:pos="2124"/>
+          <w:tab w:val="left" w:pos="2748"/>
+          <w:tab w:val="left" w:pos="3708"/>
+        </w:tabs>
+        <w:spacing w:line="240" w:lineRule="auto"/>
+        <w:jc w:val="both"/>
+        <w:rPr>
+          <w:rFonts w:hint="default" w:ascii="Times New Roman" w:hAnsi="Times New Roman" w:cs="Times New Roman"/>
+          <w:b/>
+          <w:sz w:val="24"/>
+          <w:szCs w:val="24"/>
+          <w:lang w:val="en-US"/>
+        </w:rPr>
+      </w:pPr>
+    </w:p>
+    <w:p>
+      <w:pPr>
+        <w:tabs>
+          <w:tab w:val="left" w:pos="708"/>
+          <w:tab w:val="left" w:pos="1416"/>
+          <w:tab w:val="left" w:pos="2124"/>
+          <w:tab w:val="left" w:pos="2748"/>
+          <w:tab w:val="left" w:pos="3708"/>
+        </w:tabs>
+        <w:spacing w:line="240" w:lineRule="auto"/>
+        <w:jc w:val="both"/>
+        <w:rPr>
+          <w:rFonts w:hint="default" w:ascii="Times New Roman" w:hAnsi="Times New Roman" w:cs="Times New Roman"/>
+          <w:b/>
+          <w:sz w:val="24"/>
+          <w:szCs w:val="24"/>
+          <w:highlight w:val="none"/>
+        </w:rPr>
+      </w:pPr>
+      <w:r>
+        <w:rPr>
+          <w:rFonts w:hint="default" w:cs="Times New Roman"/>
+          <w:b/>
+          <w:sz w:val="24"/>
+          <w:szCs w:val="24"/>
+          <w:lang w:val="en-US"/>
+        </w:rPr>
+        <w:tab/>
+      </w:r>
+      <w:r>
+        <w:rPr>
+          <w:rFonts w:hint="default" w:ascii="Times New Roman" w:hAnsi="Times New Roman" w:cs="Times New Roman"/>
+          <w:b/>
+          <w:sz w:val="24"/>
+          <w:szCs w:val="24"/>
           <w:shd w:val="clear" w:fill="auto"/>
           <w:lang w:val="en-US"/>
         </w:rPr>
         <w:t>${line_review_bonus}</w:t>
+      </w:r>
+      <w:r>
+        <w:rPr>
+          <w:rFonts w:hint="default" w:ascii="Times New Roman" w:hAnsi="Times New Roman" w:cs="Times New Roman"/>
+          <w:b/>
+          <w:sz w:val="24"/>
+          <w:szCs w:val="24"/>
+          <w:shd w:val="clear" w:fill="auto"/>
+          <w:lang w:val="en-US"/>
+        </w:rPr>
+        <w:tab/>
+      </w:r>
+      <w:r>
+        <w:rPr>
+          <w:rFonts w:hint="default" w:ascii="Times New Roman" w:hAnsi="Times New Roman" w:cs="Times New Roman"/>
+          <w:b/>
+          <w:sz w:val="24"/>
+          <w:szCs w:val="24"/>
+          <w:shd w:val="clear" w:fill="auto"/>
+          <w:lang w:val="en-US"/>
+        </w:rPr>
+        <w:tab/>
+      </w:r>
+      <w:r>
+        <w:rPr>
+          <w:rFonts w:hint="default" w:ascii="Times New Roman" w:hAnsi="Times New Roman" w:cs="Times New Roman"/>
+          <w:b/>
+          <w:sz w:val="24"/>
+          <w:szCs w:val="24"/>
+          <w:shd w:val="clear" w:fill="auto"/>
+          <w:lang w:val="en-US"/>
+        </w:rPr>
+        <w:t>${line_review_bonus_value}</w:t>
       </w:r>
     </w:p>
     <w:p>
@@ -5163,8 +5337,6 @@
           <w:highlight w:val="none"/>
         </w:rPr>
       </w:pPr>
-      <w:bookmarkStart w:id="6" w:name="_GoBack"/>
-      <w:bookmarkEnd w:id="6"/>
     </w:p>
     <w:p>
       <w:pPr>

</xml_diff>